<commit_message>
Update changelog and Platform Engineer resume: rebalance resume layout, sync with strengthened evidence, and remove unsupported content.
</commit_message>
<xml_diff>
--- a/resumes/platform-engineer/resume.docx
+++ b/resumes/platform-engineer/resume.docx
@@ -162,22 +162,6 @@
     </w:p>
     <w:p>
       <w:pPr>
-        <w:spacing w:after="36" w:line="245" w:lineRule="auto"/>
-        <w:ind w:left="245" w:hanging="187"/>
-        <w:keepLines/>
-      </w:pPr>
-      <w:r>
-        <w:rPr>
-          <w:color w:val="1B375C"/>
-        </w:rPr>
-        <w:t xml:space="preserve">•  </w:t>
-      </w:r>
-      <w:r>
-        <w:t>Contributed to production APIs with attention to correctness, observability, latency, and operational support.</w:t>
-      </w:r>
-    </w:p>
-    <w:p>
-      <w:pPr>
         <w:pStyle w:val="DesignedSection"/>
         <w:spacing w:before="140" w:after="60"/>
         <w:pBdr>
@@ -299,22 +283,6 @@
       </w:r>
       <w:r>
         <w:t>Supported Kubernetes deployments to the organization's self-managed data center for an Election Management System built as nearly 25 microservices.</w:t>
-      </w:r>
-    </w:p>
-    <w:p>
-      <w:pPr>
-        <w:spacing w:after="36" w:line="245" w:lineRule="auto"/>
-        <w:ind w:left="245" w:hanging="187"/>
-        <w:keepLines/>
-      </w:pPr>
-      <w:r>
-        <w:rPr>
-          <w:color w:val="1B375C"/>
-        </w:rPr>
-        <w:t xml:space="preserve">•  </w:t>
-      </w:r>
-      <w:r>
-        <w:t>Key technologies: Java, Spring Boot, Hibernate, REST APIs, Docker, Kubernetes, Keycloak.</w:t>
       </w:r>
     </w:p>
     <w:p>

</xml_diff>